<commit_message>
Refresh 1.1.1 parity artifacts
Regenerate 1.1.1 student-facing materials from the platform parity fixes, record the L1.5D-B02 plan and roadmap evidence, refresh the Part A review/quality record, and preserve the lead web-PowerPoint review as the source of the follow-up.
</commit_message>
<xml_diff>
--- a/Boek 1 - Grondslagen, vraag en aanbod/1.1 Hoofdstuk Economisch denken en rekenen/1.1.1 Schaarste en economisch denken/1.1.1 Schaarste en economisch denken – basis – antwoorden.docx
+++ b/Boek 1 - Grondslagen, vraag en aanbod/1.1 Hoofdstuk Economisch denken en rekenen/1.1.1 Schaarste en economisch denken/1.1.1 Schaarste en economisch denken – basis – antwoorden.docx
@@ -91,7 +91,7 @@
                 <w:sz w:val="22"/>
                 <w:szCs w:val="22"/>
               </w:rPr>
-              <w:t xml:space="preserve">Deze opgavenset oefent de kernbegrippen: schaarste herkennen, canonical termen, en eenvoudige berekeningen van alternatieve kosten bij twee alternatieven. Gebruik de samenvatting als naslag.</w:t>
+              <w:t xml:space="preserve">Deze opgavenset oefent de kernbegrippen: schaarste herkennen, vaste begrippen gebruiken, en eenvoudige berekeningen van alternatieve kosten bij twee alternatieven. Gebruik de samenvatting als naslag.</w:t>
             </w:r>
           </w:p>
         </w:tc>
@@ -968,7 +968,7 @@
                 <w:sz w:val="22"/>
                 <w:szCs w:val="22"/>
               </w:rPr>
-              <w:t xml:space="preserve">Canonical definitie: alternatieve kosten = de opbrengst van het BESTE niet-gekozen alternatief. Niet de som, niet het gemiddelde, niet het goedkoopste.</w:t>
+              <w:t xml:space="preserve">Vaste definitie: alternatieve kosten = de opbrengst van het BESTE niet-gekozen alternatief. Niet de som, niet het gemiddelde, niet het goedkoopste.</w:t>
             </w:r>
           </w:p>
         </w:tc>
@@ -1007,7 +1007,7 @@
           <w:sz w:val="22"/>
           <w:szCs w:val="22"/>
         </w:rPr>
-        <w:t xml:space="preserve">Welke uitspraak past bij de canonical definitie van schaarste?</w:t>
+        <w:t xml:space="preserve">Welke uitspraak past bij de vaste definitie van schaarste?</w:t>
       </w:r>
     </w:p>
     <w:p>

</xml_diff>